<commit_message>
ENT-1.1 : trame élève refaite (questionnaire, quai, palette, réception en paires, console) ; ENT-1.2 : la console devient un rappel ; corrigés 1.1 à 1.3 recalculés (66 paires au lot) ; test des séances recalé
Trame et corrigés écrits par Cowork, validés par Tristan.

Co-Authored-By: Claude Opus 5.5 <noreply@anthropic.com>
</commit_message>
<xml_diff>
--- a/contenus/trames/ENT-1.2-spartoo-preparation-trame-eleve.docx
+++ b/contenus/trames/ENT-1.2-spartoo-preparation-trame-eleve.docx
@@ -640,7 +640,7 @@
               <w:rPr>
                 <w:sz w:val="20"/>
               </w:rPr>
-              <w:t>Comprendre la console et la commande .help</w:t>
+              <w:t>Retrouver la console : prix et fournisseurs</w:t>
             </w:r>
           </w:p>
         </w:tc>
@@ -1109,13 +1109,13 @@
         <w:tblLook w:firstColumn="1" w:firstRow="1" w:lastColumn="0" w:lastRow="0" w:noHBand="0" w:noVBand="1" w:val="04A0"/>
       </w:tblPr>
       <w:tblGrid>
-        <w:gridCol w:w="5896"/>
-        <w:gridCol w:w="3742"/>
+        <w:gridCol w:w="4195"/>
+        <w:gridCol w:w="5443"/>
       </w:tblGrid>
       <w:tr>
         <w:tc>
           <w:tcPr>
-            <w:tcW w:type="dxa" w:w="5896"/>
+            <w:tcW w:type="dxa" w:w="4195"/>
             <w:shd w:fill="E8E8E8"/>
           </w:tcPr>
           <w:p>
@@ -1135,7 +1135,7 @@
         </w:tc>
         <w:tc>
           <w:tcPr>
-            <w:tcW w:type="dxa" w:w="3742"/>
+            <w:tcW w:type="dxa" w:w="5443"/>
             <w:shd w:fill="E8E8E8"/>
           </w:tcPr>
           <w:p>
@@ -1156,12 +1156,12 @@
       </w:tr>
       <w:tr>
         <w:trPr>
-          <w:trHeight w:val="510"/>
+          <w:trHeight w:val="737"/>
           <w:cantSplit/>
         </w:trPr>
         <w:tc>
           <w:tcPr>
-            <w:tcW w:type="dxa" w:w="5896"/>
+            <w:tcW w:type="dxa" w:w="4195"/>
           </w:tcPr>
           <w:p>
             <w:pPr>
@@ -1177,19 +1177,19 @@
         </w:tc>
         <w:tc>
           <w:tcPr>
-            <w:tcW w:type="dxa" w:w="3742"/>
+            <w:tcW w:type="dxa" w:w="5443"/>
           </w:tcPr>
           <w:p/>
         </w:tc>
       </w:tr>
       <w:tr>
         <w:trPr>
-          <w:trHeight w:val="510"/>
+          <w:trHeight w:val="737"/>
           <w:cantSplit/>
         </w:trPr>
         <w:tc>
           <w:tcPr>
-            <w:tcW w:type="dxa" w:w="5896"/>
+            <w:tcW w:type="dxa" w:w="4195"/>
           </w:tcPr>
           <w:p>
             <w:pPr>
@@ -1205,19 +1205,19 @@
         </w:tc>
         <w:tc>
           <w:tcPr>
-            <w:tcW w:type="dxa" w:w="3742"/>
+            <w:tcW w:type="dxa" w:w="5443"/>
           </w:tcPr>
           <w:p/>
         </w:tc>
       </w:tr>
       <w:tr>
         <w:trPr>
-          <w:trHeight w:val="510"/>
+          <w:trHeight w:val="737"/>
           <w:cantSplit/>
         </w:trPr>
         <w:tc>
           <w:tcPr>
-            <w:tcW w:type="dxa" w:w="5896"/>
+            <w:tcW w:type="dxa" w:w="4195"/>
           </w:tcPr>
           <w:p>
             <w:pPr>
@@ -1233,7 +1233,7 @@
         </w:tc>
         <w:tc>
           <w:tcPr>
-            <w:tcW w:type="dxa" w:w="3742"/>
+            <w:tcW w:type="dxa" w:w="5443"/>
           </w:tcPr>
           <w:p/>
         </w:tc>
@@ -1406,13 +1406,13 @@
         <w:tblLook w:firstColumn="1" w:firstRow="1" w:lastColumn="0" w:lastRow="0" w:noHBand="0" w:noVBand="1" w:val="04A0"/>
       </w:tblPr>
       <w:tblGrid>
-        <w:gridCol w:w="5896"/>
-        <w:gridCol w:w="3742"/>
+        <w:gridCol w:w="4195"/>
+        <w:gridCol w:w="5443"/>
       </w:tblGrid>
       <w:tr>
         <w:tc>
           <w:tcPr>
-            <w:tcW w:type="dxa" w:w="5896"/>
+            <w:tcW w:type="dxa" w:w="4195"/>
             <w:shd w:fill="E8E8E8"/>
           </w:tcPr>
           <w:p>
@@ -1432,7 +1432,7 @@
         </w:tc>
         <w:tc>
           <w:tcPr>
-            <w:tcW w:type="dxa" w:w="3742"/>
+            <w:tcW w:type="dxa" w:w="5443"/>
             <w:shd w:fill="E8E8E8"/>
           </w:tcPr>
           <w:p>
@@ -1453,12 +1453,12 @@
       </w:tr>
       <w:tr>
         <w:trPr>
-          <w:trHeight w:val="510"/>
+          <w:trHeight w:val="737"/>
           <w:cantSplit/>
         </w:trPr>
         <w:tc>
           <w:tcPr>
-            <w:tcW w:type="dxa" w:w="5896"/>
+            <w:tcW w:type="dxa" w:w="4195"/>
           </w:tcPr>
           <w:p>
             <w:pPr>
@@ -1474,7 +1474,7 @@
         </w:tc>
         <w:tc>
           <w:tcPr>
-            <w:tcW w:type="dxa" w:w="3742"/>
+            <w:tcW w:type="dxa" w:w="5443"/>
           </w:tcPr>
           <w:p/>
         </w:tc>
@@ -1546,7 +1546,7 @@
       </w:tr>
       <w:tr>
         <w:trPr>
-          <w:trHeight w:val="454"/>
+          <w:trHeight w:val="624"/>
         </w:trPr>
         <w:tc>
           <w:tcPr>
@@ -1563,7 +1563,7 @@
       </w:tr>
       <w:tr>
         <w:trPr>
-          <w:trHeight w:val="454"/>
+          <w:trHeight w:val="624"/>
         </w:trPr>
         <w:tc>
           <w:tcPr>
@@ -1580,7 +1580,7 @@
       </w:tr>
       <w:tr>
         <w:trPr>
-          <w:trHeight w:val="454"/>
+          <w:trHeight w:val="624"/>
         </w:trPr>
         <w:tc>
           <w:tcPr>
@@ -1610,13 +1610,13 @@
         <w:tblLook w:firstColumn="1" w:firstRow="1" w:lastColumn="0" w:lastRow="0" w:noHBand="0" w:noVBand="1" w:val="04A0"/>
       </w:tblPr>
       <w:tblGrid>
-        <w:gridCol w:w="5896"/>
-        <w:gridCol w:w="3742"/>
+        <w:gridCol w:w="4195"/>
+        <w:gridCol w:w="5443"/>
       </w:tblGrid>
       <w:tr>
         <w:tc>
           <w:tcPr>
-            <w:tcW w:type="dxa" w:w="5896"/>
+            <w:tcW w:type="dxa" w:w="4195"/>
             <w:shd w:fill="E8E8E8"/>
           </w:tcPr>
           <w:p>
@@ -1636,7 +1636,7 @@
         </w:tc>
         <w:tc>
           <w:tcPr>
-            <w:tcW w:type="dxa" w:w="3742"/>
+            <w:tcW w:type="dxa" w:w="5443"/>
             <w:shd w:fill="E8E8E8"/>
           </w:tcPr>
           <w:p>
@@ -1657,12 +1657,12 @@
       </w:tr>
       <w:tr>
         <w:trPr>
-          <w:trHeight w:val="510"/>
+          <w:trHeight w:val="737"/>
           <w:cantSplit/>
         </w:trPr>
         <w:tc>
           <w:tcPr>
-            <w:tcW w:type="dxa" w:w="5896"/>
+            <w:tcW w:type="dxa" w:w="4195"/>
           </w:tcPr>
           <w:p>
             <w:pPr>
@@ -1678,19 +1678,19 @@
         </w:tc>
         <w:tc>
           <w:tcPr>
-            <w:tcW w:type="dxa" w:w="3742"/>
+            <w:tcW w:type="dxa" w:w="5443"/>
           </w:tcPr>
           <w:p/>
         </w:tc>
       </w:tr>
       <w:tr>
         <w:trPr>
-          <w:trHeight w:val="510"/>
+          <w:trHeight w:val="737"/>
           <w:cantSplit/>
         </w:trPr>
         <w:tc>
           <w:tcPr>
-            <w:tcW w:type="dxa" w:w="5896"/>
+            <w:tcW w:type="dxa" w:w="4195"/>
           </w:tcPr>
           <w:p>
             <w:pPr>
@@ -1706,7 +1706,7 @@
         </w:tc>
         <w:tc>
           <w:tcPr>
-            <w:tcW w:type="dxa" w:w="3742"/>
+            <w:tcW w:type="dxa" w:w="5443"/>
           </w:tcPr>
           <w:p/>
         </w:tc>
@@ -1725,6 +1725,7 @@
     <w:p>
       <w:pPr>
         <w:keepNext/>
+        <w:pageBreakBefore/>
         <w:spacing w:before="120" w:after="80"/>
       </w:pPr>
       <w:r>
@@ -1744,13 +1745,13 @@
         <w:tblLook w:firstColumn="1" w:firstRow="1" w:lastColumn="0" w:lastRow="0" w:noHBand="0" w:noVBand="1" w:val="04A0"/>
       </w:tblPr>
       <w:tblGrid>
-        <w:gridCol w:w="5896"/>
-        <w:gridCol w:w="3742"/>
+        <w:gridCol w:w="4195"/>
+        <w:gridCol w:w="5443"/>
       </w:tblGrid>
       <w:tr>
         <w:tc>
           <w:tcPr>
-            <w:tcW w:type="dxa" w:w="5896"/>
+            <w:tcW w:type="dxa" w:w="4195"/>
             <w:shd w:fill="E8E8E8"/>
           </w:tcPr>
           <w:p>
@@ -1770,7 +1771,7 @@
         </w:tc>
         <w:tc>
           <w:tcPr>
-            <w:tcW w:type="dxa" w:w="3742"/>
+            <w:tcW w:type="dxa" w:w="5443"/>
             <w:shd w:fill="E8E8E8"/>
           </w:tcPr>
           <w:p>
@@ -1791,12 +1792,12 @@
       </w:tr>
       <w:tr>
         <w:trPr>
-          <w:trHeight w:val="510"/>
+          <w:trHeight w:val="737"/>
           <w:cantSplit/>
         </w:trPr>
         <w:tc>
           <w:tcPr>
-            <w:tcW w:type="dxa" w:w="5896"/>
+            <w:tcW w:type="dxa" w:w="4195"/>
           </w:tcPr>
           <w:p>
             <w:pPr>
@@ -1812,7 +1813,7 @@
         </w:tc>
         <w:tc>
           <w:tcPr>
-            <w:tcW w:type="dxa" w:w="3742"/>
+            <w:tcW w:type="dxa" w:w="5443"/>
           </w:tcPr>
           <w:p/>
         </w:tc>
@@ -1905,7 +1906,7 @@
       </w:tr>
       <w:tr>
         <w:trPr>
-          <w:trHeight w:val="454"/>
+          <w:trHeight w:val="624"/>
         </w:trPr>
         <w:tc>
           <w:tcPr>
@@ -1928,7 +1929,7 @@
       </w:tr>
       <w:tr>
         <w:trPr>
-          <w:trHeight w:val="454"/>
+          <w:trHeight w:val="624"/>
         </w:trPr>
         <w:tc>
           <w:tcPr>
@@ -2178,83 +2179,7 @@
           <w:color w:val="111111"/>
           <w:sz w:val="30"/>
         </w:rPr>
-        <w:t>Comprendre la console et la commande .help</w:t>
-      </w:r>
-    </w:p>
-    <w:p>
-      <w:pPr>
-        <w:spacing w:before="0" w:after="120"/>
-      </w:pPr>
-      <w:r>
-        <w:rPr>
-          <w:b w:val="0"/>
-          <w:color w:val="1A1A1A"/>
-          <w:sz w:val="22"/>
-        </w:rPr>
-        <w:t>La console permet d'interroger et de modifier la base avec des commandes qui commencent toujours par un point. Tu peux écrire les références en majuscules ou en minuscules : la console comprend les deux.</w:t>
-      </w:r>
-    </w:p>
-    <w:p>
-      <w:pPr>
-        <w:keepNext/>
-        <w:spacing w:after="80"/>
-        <w:ind w:left="454" w:hanging="454"/>
-      </w:pPr>
-      <w:r>
-        <w:rPr>
-          <w:b/>
-          <w:color w:val="111111"/>
-          <w:sz w:val="22"/>
-        </w:rPr>
-        <w:t xml:space="preserve">1.  </w:t>
-      </w:r>
-      <w:r>
-        <w:rPr>
-          <w:sz w:val="22"/>
-        </w:rPr>
-        <w:t>Va dans Console.</w:t>
-      </w:r>
-    </w:p>
-    <w:p>
-      <w:pPr>
-        <w:keepNext/>
-        <w:spacing w:after="80"/>
-        <w:ind w:left="454" w:hanging="454"/>
-      </w:pPr>
-      <w:r>
-        <w:rPr>
-          <w:b/>
-          <w:color w:val="111111"/>
-          <w:sz w:val="22"/>
-        </w:rPr>
-        <w:t xml:space="preserve">2.  </w:t>
-      </w:r>
-      <w:r>
-        <w:rPr>
-          <w:sz w:val="22"/>
-        </w:rPr>
-        <w:t>Tape .help et appuie sur Entrée : la liste complète des commandes disponibles s'affiche.</w:t>
-      </w:r>
-    </w:p>
-    <w:p>
-      <w:pPr>
-        <w:keepNext/>
-        <w:spacing w:after="80"/>
-        <w:ind w:left="454" w:hanging="454"/>
-      </w:pPr>
-      <w:r>
-        <w:rPr>
-          <w:b/>
-          <w:color w:val="111111"/>
-          <w:sz w:val="22"/>
-        </w:rPr>
-        <w:t xml:space="preserve">3.  </w:t>
-      </w:r>
-      <w:r>
-        <w:rPr>
-          <w:sz w:val="22"/>
-        </w:rPr>
-        <w:t>Observe bien la colonne de gauche (le nom exact de chaque commande) et la colonne de droite (ce qu'elle fait).</w:t>
+        <w:t>Retrouver la console : prix et fournisseurs</w:t>
       </w:r>
     </w:p>
     <w:tbl>
@@ -2286,13 +2211,13 @@
                 <w:color w:val="111111"/>
                 <w:sz w:val="20"/>
               </w:rPr>
-              <w:t xml:space="preserve">Rassure-toi : </w:t>
+              <w:t xml:space="preserve">Rappel : </w:t>
             </w:r>
             <w:r>
               <w:rPr>
                 <w:sz w:val="20"/>
               </w:rPr>
-              <w:t>si tu tapes une commande qui n'existe pas, ou si tu oublies le point, la console t'explique l'erreur et te propose de taper .help. N'hésite pas à essayer, tu ne peux rien casser !</w:t>
+              <w:t>tu as découvert la console en ENT-1.1 (.help, .movements, .getstock, .getlot). Si tu as oublié une commande, tape .help.</w:t>
             </w:r>
           </w:p>
         </w:tc>
@@ -2300,9 +2225,22 @@
     </w:tbl>
     <w:p>
       <w:pPr>
-        <w:keepNext/>
         <w:spacing w:after="40"/>
       </w:pPr>
+    </w:p>
+    <w:p>
+      <w:pPr>
+        <w:keepNext/>
+        <w:spacing w:before="120" w:after="120"/>
+      </w:pPr>
+      <w:r>
+        <w:rPr>
+          <w:b/>
+          <w:color w:val="1A1A1A"/>
+          <w:sz w:val="21"/>
+        </w:rPr>
+        <w:t>Aujourd'hui, deux nouvelles commandes : .getprice (les prix d'un article) et .getsupplier (la fiche d'un fournisseur). Va dans Console et essaie-les sur le modèle PM-SUE (Puma Suede Classic XXI) :</w:t>
+      </w:r>
     </w:p>
     <w:tbl>
       <w:tblPr>
@@ -2312,13 +2250,13 @@
         <w:tblLook w:firstColumn="1" w:firstRow="1" w:lastColumn="0" w:lastRow="0" w:noHBand="0" w:noVBand="1" w:val="04A0"/>
       </w:tblPr>
       <w:tblGrid>
-        <w:gridCol w:w="5896"/>
-        <w:gridCol w:w="3742"/>
+        <w:gridCol w:w="4195"/>
+        <w:gridCol w:w="5443"/>
       </w:tblGrid>
       <w:tr>
         <w:tc>
           <w:tcPr>
-            <w:tcW w:type="dxa" w:w="5896"/>
+            <w:tcW w:type="dxa" w:w="4195"/>
             <w:shd w:fill="E8E8E8"/>
           </w:tcPr>
           <w:p>
@@ -2338,7 +2276,7 @@
         </w:tc>
         <w:tc>
           <w:tcPr>
-            <w:tcW w:type="dxa" w:w="3742"/>
+            <w:tcW w:type="dxa" w:w="5443"/>
             <w:shd w:fill="E8E8E8"/>
           </w:tcPr>
           <w:p>
@@ -2359,242 +2297,12 @@
       </w:tr>
       <w:tr>
         <w:trPr>
-          <w:trHeight w:val="510"/>
+          <w:trHeight w:val="737"/>
           <w:cantSplit/>
         </w:trPr>
         <w:tc>
           <w:tcPr>
-            <w:tcW w:type="dxa" w:w="5896"/>
-          </w:tcPr>
-          <w:p>
-            <w:pPr>
-              <w:spacing w:after="0"/>
-            </w:pPr>
-            <w:r>
-              <w:rPr>
-                <w:sz w:val="20"/>
-              </w:rPr>
-              <w:t>Par quel caractère commence toujours une commande ?</w:t>
-            </w:r>
-          </w:p>
-        </w:tc>
-        <w:tc>
-          <w:tcPr>
-            <w:tcW w:type="dxa" w:w="3742"/>
-          </w:tcPr>
-          <w:p/>
-        </w:tc>
-      </w:tr>
-    </w:tbl>
-    <w:p>
-      <w:pPr>
-        <w:spacing w:after="0" w:line="60" w:lineRule="exact"/>
-      </w:pPr>
-      <w:r>
-        <w:rPr>
-          <w:sz w:val="10"/>
-        </w:rPr>
-      </w:r>
-    </w:p>
-    <w:p>
-      <w:pPr>
-        <w:keepNext/>
-        <w:spacing w:before="120" w:after="120"/>
-      </w:pPr>
-      <w:r>
-        <w:rPr>
-          <w:b/>
-          <w:color w:val="1A1A1A"/>
-          <w:sz w:val="21"/>
-        </w:rPr>
-        <w:t>Cite 3 commandes de la liste (par exemple .getstock) et explique en une phrase ce que fait chacune :</w:t>
-      </w:r>
-    </w:p>
-    <w:tbl>
-      <w:tblPr>
-        <w:tblStyle w:val="TableGrid"/>
-        <w:tblW w:type="auto" w:w="0"/>
-        <w:tblLayout w:type="fixed"/>
-        <w:tblLook w:firstColumn="1" w:firstRow="1" w:lastColumn="0" w:lastRow="0" w:noHBand="0" w:noVBand="1" w:val="04A0"/>
-      </w:tblPr>
-      <w:tblGrid>
-        <w:gridCol w:w="2608"/>
-        <w:gridCol w:w="7030"/>
-      </w:tblGrid>
-      <w:tr>
-        <w:tc>
-          <w:tcPr>
-            <w:tcW w:type="dxa" w:w="2608"/>
-            <w:shd w:fill="E8E8E8"/>
-          </w:tcPr>
-          <w:p>
-            <w:pPr>
-              <w:keepNext/>
-              <w:spacing w:after="0"/>
-            </w:pPr>
-            <w:r>
-              <w:rPr>
-                <w:b/>
-                <w:color w:val="111111"/>
-                <w:sz w:val="20"/>
-              </w:rPr>
-              <w:t>Commande</w:t>
-            </w:r>
-          </w:p>
-        </w:tc>
-        <w:tc>
-          <w:tcPr>
-            <w:tcW w:type="dxa" w:w="7030"/>
-            <w:shd w:fill="E8E8E8"/>
-          </w:tcPr>
-          <w:p>
-            <w:pPr>
-              <w:keepNext/>
-              <w:spacing w:after="0"/>
-            </w:pPr>
-            <w:r>
-              <w:rPr>
-                <w:b/>
-                <w:color w:val="111111"/>
-                <w:sz w:val="20"/>
-              </w:rPr>
-              <w:t>Ce qu'elle fait</w:t>
-            </w:r>
-          </w:p>
-        </w:tc>
-      </w:tr>
-      <w:tr>
-        <w:trPr>
-          <w:trHeight w:val="680"/>
-        </w:trPr>
-        <w:tc>
-          <w:tcPr>
-            <w:tcW w:type="dxa" w:w="2608"/>
-          </w:tcPr>
-          <w:p/>
-        </w:tc>
-        <w:tc>
-          <w:tcPr>
-            <w:tcW w:type="dxa" w:w="7030"/>
-          </w:tcPr>
-          <w:p/>
-        </w:tc>
-      </w:tr>
-      <w:tr>
-        <w:trPr>
-          <w:trHeight w:val="680"/>
-        </w:trPr>
-        <w:tc>
-          <w:tcPr>
-            <w:tcW w:type="dxa" w:w="2608"/>
-          </w:tcPr>
-          <w:p/>
-        </w:tc>
-        <w:tc>
-          <w:tcPr>
-            <w:tcW w:type="dxa" w:w="7030"/>
-          </w:tcPr>
-          <w:p/>
-        </w:tc>
-      </w:tr>
-      <w:tr>
-        <w:trPr>
-          <w:trHeight w:val="680"/>
-        </w:trPr>
-        <w:tc>
-          <w:tcPr>
-            <w:tcW w:type="dxa" w:w="2608"/>
-          </w:tcPr>
-          <w:p/>
-        </w:tc>
-        <w:tc>
-          <w:tcPr>
-            <w:tcW w:type="dxa" w:w="7030"/>
-          </w:tcPr>
-          <w:p/>
-        </w:tc>
-      </w:tr>
-    </w:tbl>
-    <w:p>
-      <w:pPr>
-        <w:spacing w:after="40"/>
-      </w:pPr>
-    </w:p>
-    <w:p>
-      <w:pPr>
-        <w:keepNext/>
-        <w:spacing w:before="120" w:after="120"/>
-      </w:pPr>
-      <w:r>
-        <w:rPr>
-          <w:b/>
-          <w:color w:val="1A1A1A"/>
-          <w:sz w:val="21"/>
-        </w:rPr>
-        <w:t>Teste maintenant deux commandes sur la référence PM-SUE (le modèle Puma Suede Classic XXI) :</w:t>
-      </w:r>
-    </w:p>
-    <w:tbl>
-      <w:tblPr>
-        <w:tblStyle w:val="TableGrid"/>
-        <w:tblW w:type="auto" w:w="0"/>
-        <w:tblLayout w:type="fixed"/>
-        <w:tblLook w:firstColumn="1" w:firstRow="1" w:lastColumn="0" w:lastRow="0" w:noHBand="0" w:noVBand="1" w:val="04A0"/>
-      </w:tblPr>
-      <w:tblGrid>
-        <w:gridCol w:w="5896"/>
-        <w:gridCol w:w="3742"/>
-      </w:tblGrid>
-      <w:tr>
-        <w:tc>
-          <w:tcPr>
-            <w:tcW w:type="dxa" w:w="5896"/>
-            <w:shd w:fill="E8E8E8"/>
-          </w:tcPr>
-          <w:p>
-            <w:pPr>
-              <w:keepNext/>
-              <w:spacing w:after="0"/>
-            </w:pPr>
-            <w:r>
-              <w:rPr>
-                <w:b/>
-                <w:color w:val="111111"/>
-                <w:sz w:val="20"/>
-              </w:rPr>
-              <w:t>Question</w:t>
-            </w:r>
-          </w:p>
-        </w:tc>
-        <w:tc>
-          <w:tcPr>
-            <w:tcW w:type="dxa" w:w="3742"/>
-            <w:shd w:fill="E8E8E8"/>
-          </w:tcPr>
-          <w:p>
-            <w:pPr>
-              <w:keepNext/>
-              <w:spacing w:after="0"/>
-            </w:pPr>
-            <w:r>
-              <w:rPr>
-                <w:b/>
-                <w:color w:val="111111"/>
-                <w:sz w:val="20"/>
-              </w:rPr>
-              <w:t>Ta réponse</w:t>
-            </w:r>
-          </w:p>
-        </w:tc>
-      </w:tr>
-      <w:tr>
-        <w:trPr>
-          <w:trHeight w:val="510"/>
-          <w:cantSplit/>
-        </w:trPr>
-        <w:tc>
-          <w:tcPr>
-            <w:tcW w:type="dxa" w:w="5896"/>
+            <w:tcW w:type="dxa" w:w="4195"/>
           </w:tcPr>
           <w:p>
             <w:pPr>
@@ -2610,19 +2318,19 @@
         </w:tc>
         <w:tc>
           <w:tcPr>
-            <w:tcW w:type="dxa" w:w="3742"/>
+            <w:tcW w:type="dxa" w:w="5443"/>
           </w:tcPr>
           <w:p/>
         </w:tc>
       </w:tr>
       <w:tr>
         <w:trPr>
-          <w:trHeight w:val="510"/>
+          <w:trHeight w:val="737"/>
           <w:cantSplit/>
         </w:trPr>
         <w:tc>
           <w:tcPr>
-            <w:tcW w:type="dxa" w:w="5896"/>
+            <w:tcW w:type="dxa" w:w="4195"/>
           </w:tcPr>
           <w:p>
             <w:pPr>
@@ -2638,19 +2346,19 @@
         </w:tc>
         <w:tc>
           <w:tcPr>
-            <w:tcW w:type="dxa" w:w="3742"/>
+            <w:tcW w:type="dxa" w:w="5443"/>
           </w:tcPr>
           <w:p/>
         </w:tc>
       </w:tr>
       <w:tr>
         <w:trPr>
-          <w:trHeight w:val="510"/>
+          <w:trHeight w:val="737"/>
           <w:cantSplit/>
         </w:trPr>
         <w:tc>
           <w:tcPr>
-            <w:tcW w:type="dxa" w:w="5896"/>
+            <w:tcW w:type="dxa" w:w="4195"/>
           </w:tcPr>
           <w:p>
             <w:pPr>
@@ -2666,7 +2374,7 @@
         </w:tc>
         <w:tc>
           <w:tcPr>
-            <w:tcW w:type="dxa" w:w="3742"/>
+            <w:tcW w:type="dxa" w:w="5443"/>
           </w:tcPr>
           <w:p/>
         </w:tc>
@@ -2839,13 +2547,13 @@
         <w:tblLook w:firstColumn="1" w:firstRow="1" w:lastColumn="0" w:lastRow="0" w:noHBand="0" w:noVBand="1" w:val="04A0"/>
       </w:tblPr>
       <w:tblGrid>
-        <w:gridCol w:w="5896"/>
-        <w:gridCol w:w="3742"/>
+        <w:gridCol w:w="4195"/>
+        <w:gridCol w:w="5443"/>
       </w:tblGrid>
       <w:tr>
         <w:tc>
           <w:tcPr>
-            <w:tcW w:type="dxa" w:w="5896"/>
+            <w:tcW w:type="dxa" w:w="4195"/>
             <w:shd w:fill="E8E8E8"/>
           </w:tcPr>
           <w:p>
@@ -2865,7 +2573,7 @@
         </w:tc>
         <w:tc>
           <w:tcPr>
-            <w:tcW w:type="dxa" w:w="3742"/>
+            <w:tcW w:type="dxa" w:w="5443"/>
             <w:shd w:fill="E8E8E8"/>
           </w:tcPr>
           <w:p>
@@ -2886,12 +2594,12 @@
       </w:tr>
       <w:tr>
         <w:trPr>
-          <w:trHeight w:val="510"/>
+          <w:trHeight w:val="737"/>
           <w:cantSplit/>
         </w:trPr>
         <w:tc>
           <w:tcPr>
-            <w:tcW w:type="dxa" w:w="5896"/>
+            <w:tcW w:type="dxa" w:w="4195"/>
           </w:tcPr>
           <w:p>
             <w:pPr>
@@ -2907,7 +2615,7 @@
         </w:tc>
         <w:tc>
           <w:tcPr>
-            <w:tcW w:type="dxa" w:w="3742"/>
+            <w:tcW w:type="dxa" w:w="5443"/>
           </w:tcPr>
           <w:p/>
         </w:tc>
@@ -3141,13 +2849,13 @@
         <w:tblLook w:firstColumn="1" w:firstRow="1" w:lastColumn="0" w:lastRow="0" w:noHBand="0" w:noVBand="1" w:val="04A0"/>
       </w:tblPr>
       <w:tblGrid>
-        <w:gridCol w:w="5896"/>
-        <w:gridCol w:w="3742"/>
+        <w:gridCol w:w="4195"/>
+        <w:gridCol w:w="5443"/>
       </w:tblGrid>
       <w:tr>
         <w:tc>
           <w:tcPr>
-            <w:tcW w:type="dxa" w:w="5896"/>
+            <w:tcW w:type="dxa" w:w="4195"/>
             <w:shd w:fill="E8E8E8"/>
           </w:tcPr>
           <w:p>
@@ -3167,7 +2875,7 @@
         </w:tc>
         <w:tc>
           <w:tcPr>
-            <w:tcW w:type="dxa" w:w="3742"/>
+            <w:tcW w:type="dxa" w:w="5443"/>
             <w:shd w:fill="E8E8E8"/>
           </w:tcPr>
           <w:p>
@@ -3188,12 +2896,12 @@
       </w:tr>
       <w:tr>
         <w:trPr>
-          <w:trHeight w:val="510"/>
+          <w:trHeight w:val="737"/>
           <w:cantSplit/>
         </w:trPr>
         <w:tc>
           <w:tcPr>
-            <w:tcW w:type="dxa" w:w="5896"/>
+            <w:tcW w:type="dxa" w:w="4195"/>
           </w:tcPr>
           <w:p>
             <w:pPr>
@@ -3209,19 +2917,19 @@
         </w:tc>
         <w:tc>
           <w:tcPr>
-            <w:tcW w:type="dxa" w:w="3742"/>
+            <w:tcW w:type="dxa" w:w="5443"/>
           </w:tcPr>
           <w:p/>
         </w:tc>
       </w:tr>
       <w:tr>
         <w:trPr>
-          <w:trHeight w:val="510"/>
+          <w:trHeight w:val="737"/>
           <w:cantSplit/>
         </w:trPr>
         <w:tc>
           <w:tcPr>
-            <w:tcW w:type="dxa" w:w="5896"/>
+            <w:tcW w:type="dxa" w:w="4195"/>
           </w:tcPr>
           <w:p>
             <w:pPr>
@@ -3237,19 +2945,19 @@
         </w:tc>
         <w:tc>
           <w:tcPr>
-            <w:tcW w:type="dxa" w:w="3742"/>
+            <w:tcW w:type="dxa" w:w="5443"/>
           </w:tcPr>
           <w:p/>
         </w:tc>
       </w:tr>
       <w:tr>
         <w:trPr>
-          <w:trHeight w:val="510"/>
+          <w:trHeight w:val="737"/>
           <w:cantSplit/>
         </w:trPr>
         <w:tc>
           <w:tcPr>
-            <w:tcW w:type="dxa" w:w="5896"/>
+            <w:tcW w:type="dxa" w:w="4195"/>
           </w:tcPr>
           <w:p>
             <w:pPr>
@@ -3265,7 +2973,7 @@
         </w:tc>
         <w:tc>
           <w:tcPr>
-            <w:tcW w:type="dxa" w:w="3742"/>
+            <w:tcW w:type="dxa" w:w="5443"/>
           </w:tcPr>
           <w:p/>
         </w:tc>
@@ -4325,13 +4033,13 @@
         <w:tblLook w:firstColumn="1" w:firstRow="1" w:lastColumn="0" w:lastRow="0" w:noHBand="0" w:noVBand="1" w:val="04A0"/>
       </w:tblPr>
       <w:tblGrid>
-        <w:gridCol w:w="5896"/>
-        <w:gridCol w:w="3742"/>
+        <w:gridCol w:w="4195"/>
+        <w:gridCol w:w="5443"/>
       </w:tblGrid>
       <w:tr>
         <w:tc>
           <w:tcPr>
-            <w:tcW w:type="dxa" w:w="5896"/>
+            <w:tcW w:type="dxa" w:w="4195"/>
             <w:shd w:fill="E8E8E8"/>
           </w:tcPr>
           <w:p>
@@ -4351,7 +4059,7 @@
         </w:tc>
         <w:tc>
           <w:tcPr>
-            <w:tcW w:type="dxa" w:w="3742"/>
+            <w:tcW w:type="dxa" w:w="5443"/>
             <w:shd w:fill="E8E8E8"/>
           </w:tcPr>
           <w:p>
@@ -4372,12 +4080,12 @@
       </w:tr>
       <w:tr>
         <w:trPr>
-          <w:trHeight w:val="510"/>
+          <w:trHeight w:val="737"/>
           <w:cantSplit/>
         </w:trPr>
         <w:tc>
           <w:tcPr>
-            <w:tcW w:type="dxa" w:w="5896"/>
+            <w:tcW w:type="dxa" w:w="4195"/>
           </w:tcPr>
           <w:p>
             <w:pPr>
@@ -4393,19 +4101,19 @@
         </w:tc>
         <w:tc>
           <w:tcPr>
-            <w:tcW w:type="dxa" w:w="3742"/>
+            <w:tcW w:type="dxa" w:w="5443"/>
           </w:tcPr>
           <w:p/>
         </w:tc>
       </w:tr>
       <w:tr>
         <w:trPr>
-          <w:trHeight w:val="510"/>
+          <w:trHeight w:val="737"/>
           <w:cantSplit/>
         </w:trPr>
         <w:tc>
           <w:tcPr>
-            <w:tcW w:type="dxa" w:w="5896"/>
+            <w:tcW w:type="dxa" w:w="4195"/>
           </w:tcPr>
           <w:p>
             <w:pPr>
@@ -4421,7 +4129,7 @@
         </w:tc>
         <w:tc>
           <w:tcPr>
-            <w:tcW w:type="dxa" w:w="3742"/>
+            <w:tcW w:type="dxa" w:w="5443"/>
           </w:tcPr>
           <w:p/>
         </w:tc>
@@ -5554,13 +5262,13 @@
         <w:tblLook w:firstColumn="1" w:firstRow="1" w:lastColumn="0" w:lastRow="0" w:noHBand="0" w:noVBand="1" w:val="04A0"/>
       </w:tblPr>
       <w:tblGrid>
-        <w:gridCol w:w="5896"/>
-        <w:gridCol w:w="3742"/>
+        <w:gridCol w:w="4195"/>
+        <w:gridCol w:w="5443"/>
       </w:tblGrid>
       <w:tr>
         <w:tc>
           <w:tcPr>
-            <w:tcW w:type="dxa" w:w="5896"/>
+            <w:tcW w:type="dxa" w:w="4195"/>
             <w:shd w:fill="E8E8E8"/>
           </w:tcPr>
           <w:p>
@@ -5580,7 +5288,7 @@
         </w:tc>
         <w:tc>
           <w:tcPr>
-            <w:tcW w:type="dxa" w:w="3742"/>
+            <w:tcW w:type="dxa" w:w="5443"/>
             <w:shd w:fill="E8E8E8"/>
           </w:tcPr>
           <w:p>
@@ -5601,12 +5309,12 @@
       </w:tr>
       <w:tr>
         <w:trPr>
-          <w:trHeight w:val="510"/>
+          <w:trHeight w:val="737"/>
           <w:cantSplit/>
         </w:trPr>
         <w:tc>
           <w:tcPr>
-            <w:tcW w:type="dxa" w:w="5896"/>
+            <w:tcW w:type="dxa" w:w="4195"/>
           </w:tcPr>
           <w:p>
             <w:pPr>
@@ -5622,7 +5330,7 @@
         </w:tc>
         <w:tc>
           <w:tcPr>
-            <w:tcW w:type="dxa" w:w="3742"/>
+            <w:tcW w:type="dxa" w:w="5443"/>
           </w:tcPr>
           <w:p/>
         </w:tc>

</xml_diff>